<commit_message>
Apply supervisor edits to project submission chapters
Remove six cross-reference clauses/sentences the supervisor
struck through (Sections 3.3, 3.11, 4.2, 4.4, 4.5) and change the
Section 5.4 recommendations list from decimal to lowercase roman
numeral numbering, per feedback. Propagated to every cumulative
chapter snapshot that contains the affected sections (CH3, CH4,
CH5, FINAL); CH1/CH2 contain none of this text so are untouched.

Co-Authored-By: Claude Sonnet 5 <noreply@anthropic.com>
Claude-Session: https://claude.ai/code/session_01CtSjarowGcTD749UHkw1Xh
</commit_message>
<xml_diff>
--- a/docs/PROJECT_SUBMISSION_CH3.docx
+++ b/docs/PROJECT_SUBMISSION_CH3.docx
@@ -2692,21 +2692,21 @@
           <w:sz w:val="24"/>
           <w:szCs w:val="24"/>
         </w:rPr>
-        <w:t xml:space="preserve">The system's calibration methodology requires vehicle-arrival counts collected at the Sapon Under-bridge Junction, per direction (north, south, east, west), across peak and off-peak sessions, recorded as five-minute interval counts (a session date, a direction, a period, an interval start time, the interval length in minutes, and the observed vehicle count). For this submission, that dataset is a synthetic placeholder (structured identically to what a real field survey would produce and documented as such in the repository, so a genuine survey's counts can be substituted as a drop-in file replacement with no code changes) pending an actual field survey at the junction; this limitation is discussed further in Section 1.6 and revisited as future work in Chapter Five.</w:t>
-      </w:r>
-    </w:p>
-    <w:p>
-      <w:pPr>
-        <w:spacing w:after="240" w:line="480" w:lineRule="auto"/>
-        <w:jc w:val="both"/>
-      </w:pPr>
-      <w:r>
-        <w:rPr>
-          <w:rFonts w:ascii="Times New Roman" w:cs="Times New Roman" w:eastAsia="Times New Roman" w:hAnsi="Times New Roman"/>
-          <w:sz w:val="24"/>
-          <w:szCs w:val="24"/>
-        </w:rPr>
-        <w:t xml:space="preserve">Each direction/period combination's counts are fit to a Poisson distribution using scipy.stats, with a chi-square goodness-of-fit test computed for every fit; a negative binomial distribution is the documented fallback should a given direction/period's counts prove over-dispersed relative to a Poisson assumption. The fitted rate parameter (λ, in vehicles per five-minute interval) for each of the eight direction/period combinations is what ultimately drives SUMO's vehicle-insertion process for that scenario, converted to a per-second insertion probability for the corresponding route flow. The fitted parameters obtained for the calibration data used in this project are reported in Table 4.1, in Chapter Four, alongside their goodness-of-fit results.</w:t>
+        <w:t xml:space="preserve">The system's calibration methodology requires vehicle-arrival counts collected at the Sapon Under-bridge Junction, per direction (north, south, east, west), across peak and off-peak sessions, recorded as five-minute interval counts (a session date, a direction, a period, an interval start time, the interval length in minutes, and the observed vehicle count). For this submission, that dataset is a synthetic placeholder (structured identically to what a real field survey would produce and documented as such in the repository, so a genuine survey's counts can be substituted as a drop-in file replacement with no code changes) pending an actual field survey at the junction.</w:t>
+      </w:r>
+    </w:p>
+    <w:p>
+      <w:pPr>
+        <w:spacing w:after="240" w:line="480" w:lineRule="auto"/>
+        <w:jc w:val="both"/>
+      </w:pPr>
+      <w:r>
+        <w:rPr>
+          <w:rFonts w:ascii="Times New Roman" w:cs="Times New Roman" w:eastAsia="Times New Roman" w:hAnsi="Times New Roman"/>
+          <w:sz w:val="24"/>
+          <w:szCs w:val="24"/>
+        </w:rPr>
+        <w:t xml:space="preserve">Each direction/period combination's counts are fit to a Poisson distribution using scipy.stats, with a chi-square goodness-of-fit test computed for every fit; a negative binomial distribution is the documented fallback should a given direction/period's counts prove over-dispersed relative to a Poisson assumption. The fitted rate parameter (λ, in vehicles per five-minute interval) for each of the eight direction/period combinations is what ultimately drives SUMO's vehicle-insertion process for that scenario, converted to a per-second insertion probability for the corresponding route flow.</w:t>
       </w:r>
     </w:p>
     <w:p>
@@ -4616,7 +4616,7 @@
           <w:sz w:val="24"/>
           <w:szCs w:val="24"/>
         </w:rPr>
-        <w:t xml:space="preserve">The intelligent controller is evaluated against a fixed-time baseline controller on the same calibrated scenario, run twice under identical conditions (once under the full runtime control loop described in Section 3.7, and once under a fixed-time controller that cycles through the same nine-phase space on fixed, pre-set durations with no model input and no priority pre-emption) so that any difference in the reported metrics is attributable to the controller, not to a difference in the traffic itself. Four metrics are computed from the logged state of each run: average waiting time (seconds), average queue length (vehicles), throughput (vehicles cleared per hour), and priority-vehicle (emergency) response time (seconds, from an emergency vehicle's detection to its clearing the junction). Runs are seeded, so the same scenario and seed reproduce the same vehicle-arrival sequence under both controllers, making the comparison a controlled one rather than a comparison across two different, randomly-drawn traffic samples. Chapter Four reports the results of this evaluation on both the calibrated peak-hour and off-peak scenarios.</w:t>
+        <w:t xml:space="preserve">The intelligent controller is evaluated against a fixed-time baseline controller on the same calibrated scenario, run twice under identical conditions (once under the full runtime control loop described in Section 3.7, and once under a fixed-time controller that cycles through the same nine-phase space on fixed, pre-set durations with no model input and no priority pre-emption) so that any difference in the reported metrics is attributable to the controller, not to a difference in the traffic itself. Four metrics are computed from the logged state of each run: average waiting time (seconds), average queue length (vehicles), throughput (vehicles cleared per hour), and priority-vehicle (emergency) response time (seconds, from an emergency vehicle's detection to its clearing the junction). Runs are seeded, so the same scenario and seed reproduce the same vehicle-arrival sequence under both controllers, making the comparison a controlled one rather than a comparison across two different, randomly-drawn traffic samples.</w:t>
       </w:r>
     </w:p>
     <w:p>

</xml_diff>

<commit_message>
Vary repetitive 'This chapter...' openings in Chapters 2-4
Chapters Two, Three, and Four all opened with the identical
"This chapter [verb]..." template. Reworded each opening sentence
with a distinct construction while preserving the same content,
propagated to every cumulative snapshot containing that chapter
(CH2+ for Ch.2, CH3+ for Ch.3, CH4+ for Ch.4).

Co-Authored-By: Claude Sonnet 5 <noreply@anthropic.com>
Claude-Session: https://claude.ai/code/session_01CtSjarowGcTD749UHkw1Xh
</commit_message>
<xml_diff>
--- a/docs/PROJECT_SUBMISSION_CH3.docx
+++ b/docs/PROJECT_SUBMISSION_CH3.docx
@@ -2161,7 +2161,7 @@
           <w:sz w:val="24"/>
           <w:szCs w:val="24"/>
         </w:rPr>
-        <w:t xml:space="preserve">This chapter positions MaHanya within four streams of prior work the reader should expect to encounter across the sections that follow. Section 2.1 traces signal control from fixed-time plans through to traffic-responsive systems such as SCOOT and SCATS, establishing the demand-responsive principle this project inherits at a smaller scale. Section 2.2 reviews learned approaches to signal control: reinforcement-learning controllers and, more directly relevant to this project’s own model design, attention-based sequence models applied to phase recommendation. Section 2.3 examines microscopic traffic simulation, and specifically SUMO, as the calibration and evaluation substrate this project relies on, in place of physical field trials, following the same practice as the learned-control studies reviewed in Section 2.2. Section 2.4 identifies the gap in that literature this project is built to close: the absence, in most of it, of an explicit, model-independent safety layer standing between a learned controller’s recommendation and the signal state actually applied. Section 2.5 closes the chapter by drawing these four threads together into the specific position MaHanya occupies in the literature reviewed.</w:t>
+        <w:t xml:space="preserve">Four streams of prior work position MaHanya within the literature, taken up in turn across the sections that follow. Section 2.1 traces signal control from fixed-time plans through to traffic-responsive systems such as SCOOT and SCATS, establishing the demand-responsive principle this project inherits at a smaller scale. Section 2.2 reviews learned approaches to signal control: reinforcement-learning controllers and, more directly relevant to this project’s own model design, attention-based sequence models applied to phase recommendation. Section 2.3 examines microscopic traffic simulation, and specifically SUMO, as the calibration and evaluation substrate this project relies on, in place of physical field trials, following the same practice as the learned-control studies reviewed in Section 2.2. Section 2.4 identifies the gap in that literature this project is built to close: the absence, in most of it, of an explicit, model-independent safety layer standing between a learned controller’s recommendation and the signal state actually applied. Section 2.5 closes the chapter by drawing these four threads together into the specific position MaHanya occupies in the literature reviewed.</w:t>
       </w:r>
     </w:p>
     <w:p>
@@ -2426,7 +2426,7 @@
           <w:sz w:val="24"/>
           <w:szCs w:val="24"/>
         </w:rPr>
-        <w:t xml:space="preserve">This chapter sets out how MaHanya was analysed, designed, and built, in the order a reader encountering the system for the first time would need it explained. Section 3.1 gives a system-level overview of the two independently deployable projects that make up MaHanya and how they communicate, together with a use case diagram showing who and what interacts with the running system and why. Section 3.2 lists the development tools and technology stack the project depends on. Sections 3.3 through 3.6 describe the offline pipeline that produces a trained model: field data collection and statistical calibration, SUMO scenario calibration, sequence generation, and the Transformer Encoder model’s own design. Section 3.7 describes the priority-aware scheduler (the deterministic rule engine that is the sole authority over what signal state is actually applied) and Section 3.8 describes the dashboard that makes the running system’s behaviour visible and auditable in real time. Section 3.9 summarises the full pipeline end to end, Section 3.10 sets out the component and module design within the api/ and web/ projects, and Section 3.11 closes the chapter with the methodology used to evaluate the resulting controller against a fixed-time baseline.</w:t>
+        <w:t xml:space="preserve">How MaHanya was analysed, designed, and built is set out below, in the order a reader encountering the system for the first time would need it explained. Section 3.1 gives a system-level overview of the two independently deployable projects that make up MaHanya and how they communicate, together with a use case diagram showing who and what interacts with the running system and why. Section 3.2 lists the development tools and technology stack the project depends on. Sections 3.3 through 3.6 describe the offline pipeline that produces a trained model: field data collection and statistical calibration, SUMO scenario calibration, sequence generation, and the Transformer Encoder model’s own design. Section 3.7 describes the priority-aware scheduler (the deterministic rule engine that is the sole authority over what signal state is actually applied) and Section 3.8 describes the dashboard that makes the running system’s behaviour visible and auditable in real time. Section 3.9 summarises the full pipeline end to end, Section 3.10 sets out the component and module design within the api/ and web/ projects, and Section 3.11 closes the chapter with the methodology used to evaluate the resulting controller against a fixed-time baseline.</w:t>
       </w:r>
     </w:p>
     <w:p>

</xml_diff>